<commit_message>
updated and cleaned final code
</commit_message>
<xml_diff>
--- a/README.docx
+++ b/README.docx
@@ -22,12 +22,25 @@
         <w:t>This README.txt file was updated on</w:t>
       </w:r>
       <w:r>
-        <w:t>: February 24, 2026</w:t>
+        <w:t xml:space="preserve">: </w:t>
+      </w:r>
+      <w:r>
+        <w:t>March</w:t>
+      </w:r>
+      <w:r>
+        <w:t xml:space="preserve"> </w:t>
+      </w:r>
+      <w:r>
+        <w:t>11</w:t>
+      </w:r>
+      <w:r>
+        <w:t>, 2026</w:t>
       </w:r>
       <w:r>
         <w:t>  </w:t>
       </w:r>
     </w:p>
+    <w:p/>
     <w:p>
       <w:pPr>
         <w:rPr>
@@ -99,11 +112,6 @@
     </w:p>
     <w:p>
       <w:r>
-        <w:t>Names, institutions of all authors</w:t>
-      </w:r>
-    </w:p>
-    <w:p>
-      <w:r>
         <w:t xml:space="preserve">Volker H.W. Rudolf, </w:t>
       </w:r>
       <w:proofErr w:type="spellStart"/>
@@ -168,10 +176,7 @@
     </w:p>
     <w:p>
       <w:r>
-        <w:t>E</w:t>
-      </w:r>
-      <w:r>
-        <w:t>mail</w:t>
+        <w:t>Email</w:t>
       </w:r>
       <w:r>
         <w:t>: Volker.rudolf@rice.edu</w:t>
@@ -426,10 +431,7 @@
         </w:numPr>
       </w:pPr>
       <w:r>
-        <w:t>LufkinClimatedata1906-2025.csv</w:t>
-      </w:r>
-      <w:r>
-        <w:t xml:space="preserve">; Climate data for study region. </w:t>
+        <w:t xml:space="preserve">LufkinClimatedata1906-2025.csv; Climate data for study region. </w:t>
       </w:r>
       <w:r>
         <w:rPr>
@@ -522,16 +524,7 @@
       </w:pPr>
       <w:r>
         <w:lastRenderedPageBreak/>
-        <w:t>Climatedata2001-2025.csv</w:t>
-      </w:r>
-      <w:r>
-        <w:t>;</w:t>
-      </w:r>
-      <w:r>
-        <w:t xml:space="preserve"> </w:t>
-      </w:r>
-      <w:r>
-        <w:t xml:space="preserve">Same as </w:t>
+        <w:t xml:space="preserve">Climatedata2001-2025.csv; Same as </w:t>
       </w:r>
       <w:proofErr w:type="gramStart"/>
       <w:r>
@@ -706,13 +699,7 @@
         <w:t>None, D0, D1, D3, D4</w:t>
       </w:r>
       <w:r>
-        <w:t xml:space="preserve"> indicate </w:t>
-      </w:r>
-      <w:r>
-        <w:t xml:space="preserve">% of area </w:t>
-      </w:r>
-      <w:r>
-        <w:t xml:space="preserve">in respective drought severity index with D4 most extreme drought. </w:t>
+        <w:t xml:space="preserve"> indicate % of area in respective drought severity index with D4 most extreme drought. </w:t>
       </w:r>
       <w:proofErr w:type="spellStart"/>
       <w:r>
@@ -753,13 +740,7 @@
         <w:t xml:space="preserve">: </w:t>
       </w:r>
       <w:r>
-        <w:t xml:space="preserve">End </w:t>
-      </w:r>
-      <w:r>
-        <w:t>of period to report index</w:t>
-      </w:r>
-      <w:r>
-        <w:t xml:space="preserve">. </w:t>
+        <w:t xml:space="preserve">End of period to report index. </w:t>
       </w:r>
       <w:proofErr w:type="spellStart"/>
       <w:r>
@@ -858,24 +839,50 @@
         <w:rPr>
           <w:rFonts w:ascii="Times New Roman" w:hAnsi="Times New Roman" w:cs="Times New Roman"/>
         </w:rPr>
+        <w:t xml:space="preserve">, GC: </w:t>
+      </w:r>
+      <w:proofErr w:type="spellStart"/>
+      <w:r>
+        <w:rPr>
+          <w:rFonts w:ascii="Times New Roman" w:hAnsi="Times New Roman" w:cs="Times New Roman"/>
+          <w:i/>
+          <w:iCs/>
+        </w:rPr>
+        <w:t>Gastrophryne</w:t>
+      </w:r>
+      <w:proofErr w:type="spellEnd"/>
+      <w:r>
+        <w:rPr>
+          <w:rFonts w:ascii="Times New Roman" w:hAnsi="Times New Roman" w:cs="Times New Roman"/>
+          <w:i/>
+          <w:iCs/>
+        </w:rPr>
+        <w:t xml:space="preserve"> </w:t>
+      </w:r>
+      <w:proofErr w:type="spellStart"/>
+      <w:r>
+        <w:rPr>
+          <w:rFonts w:ascii="Times New Roman" w:hAnsi="Times New Roman" w:cs="Times New Roman"/>
+          <w:i/>
+          <w:iCs/>
+        </w:rPr>
+        <w:t>caroliensis</w:t>
+      </w:r>
+      <w:proofErr w:type="spellEnd"/>
+      <w:r>
+        <w:rPr>
+          <w:rFonts w:ascii="Times New Roman" w:hAnsi="Times New Roman" w:cs="Times New Roman"/>
+          <w:i/>
+          <w:iCs/>
+        </w:rPr>
         <w:t xml:space="preserve">, </w:t>
       </w:r>
       <w:r>
         <w:rPr>
           <w:rFonts w:ascii="Times New Roman" w:hAnsi="Times New Roman" w:cs="Times New Roman"/>
         </w:rPr>
-        <w:t xml:space="preserve">GC: </w:t>
-      </w:r>
-      <w:proofErr w:type="spellStart"/>
-      <w:r>
-        <w:rPr>
-          <w:rFonts w:ascii="Times New Roman" w:hAnsi="Times New Roman" w:cs="Times New Roman"/>
-          <w:i/>
-          <w:iCs/>
-        </w:rPr>
-        <w:t>Gastrophryne</w:t>
-      </w:r>
-      <w:proofErr w:type="spellEnd"/>
+        <w:t>HV:</w:t>
+      </w:r>
       <w:r>
         <w:rPr>
           <w:rFonts w:ascii="Times New Roman" w:hAnsi="Times New Roman" w:cs="Times New Roman"/>
@@ -884,14 +891,44 @@
         </w:rPr>
         <w:t xml:space="preserve"> </w:t>
       </w:r>
-      <w:proofErr w:type="spellStart"/>
-      <w:r>
-        <w:rPr>
-          <w:rFonts w:ascii="Times New Roman" w:hAnsi="Times New Roman" w:cs="Times New Roman"/>
-          <w:i/>
-          <w:iCs/>
-        </w:rPr>
-        <w:t>caroliensis</w:t>
+      <w:r>
+        <w:rPr>
+          <w:rFonts w:ascii="Times New Roman" w:hAnsi="Times New Roman" w:cs="Times New Roman"/>
+          <w:i/>
+          <w:iCs/>
+        </w:rPr>
+        <w:t xml:space="preserve">Hyla versicolor, </w:t>
+      </w:r>
+      <w:r>
+        <w:rPr>
+          <w:rFonts w:ascii="Times New Roman" w:hAnsi="Times New Roman" w:cs="Times New Roman"/>
+        </w:rPr>
+        <w:t xml:space="preserve">HC: </w:t>
+      </w:r>
+      <w:r>
+        <w:rPr>
+          <w:rFonts w:ascii="Times New Roman" w:hAnsi="Times New Roman" w:cs="Times New Roman"/>
+          <w:i/>
+          <w:iCs/>
+        </w:rPr>
+        <w:t xml:space="preserve">Hyla </w:t>
+      </w:r>
+      <w:proofErr w:type="spellStart"/>
+      <w:r>
+        <w:rPr>
+          <w:rFonts w:ascii="Times New Roman" w:hAnsi="Times New Roman" w:cs="Times New Roman"/>
+          <w:i/>
+          <w:iCs/>
+        </w:rPr>
+        <w:t>cineri</w:t>
+      </w:r>
+      <w:r>
+        <w:rPr>
+          <w:rFonts w:ascii="Times New Roman" w:hAnsi="Times New Roman" w:cs="Times New Roman"/>
+          <w:i/>
+          <w:iCs/>
+        </w:rPr>
+        <w:t>a</w:t>
       </w:r>
       <w:proofErr w:type="spellEnd"/>
       <w:r>
@@ -906,7 +943,7 @@
         <w:rPr>
           <w:rFonts w:ascii="Times New Roman" w:hAnsi="Times New Roman" w:cs="Times New Roman"/>
         </w:rPr>
-        <w:t>HV:</w:t>
+        <w:t>BV:</w:t>
       </w:r>
       <w:r>
         <w:rPr>
@@ -916,44 +953,32 @@
         </w:rPr>
         <w:t xml:space="preserve"> </w:t>
       </w:r>
-      <w:r>
-        <w:rPr>
-          <w:rFonts w:ascii="Times New Roman" w:hAnsi="Times New Roman" w:cs="Times New Roman"/>
-          <w:i/>
-          <w:iCs/>
-        </w:rPr>
-        <w:t xml:space="preserve">Hyla versicolor, </w:t>
-      </w:r>
-      <w:r>
-        <w:rPr>
-          <w:rFonts w:ascii="Times New Roman" w:hAnsi="Times New Roman" w:cs="Times New Roman"/>
-        </w:rPr>
-        <w:t xml:space="preserve">HC: </w:t>
-      </w:r>
-      <w:r>
-        <w:rPr>
-          <w:rFonts w:ascii="Times New Roman" w:hAnsi="Times New Roman" w:cs="Times New Roman"/>
-          <w:i/>
-          <w:iCs/>
-        </w:rPr>
-        <w:t xml:space="preserve">Hyla </w:t>
-      </w:r>
-      <w:proofErr w:type="spellStart"/>
-      <w:r>
-        <w:rPr>
-          <w:rFonts w:ascii="Times New Roman" w:hAnsi="Times New Roman" w:cs="Times New Roman"/>
-          <w:i/>
-          <w:iCs/>
-        </w:rPr>
-        <w:t>cineri</w:t>
-      </w:r>
-      <w:r>
-        <w:rPr>
-          <w:rFonts w:ascii="Times New Roman" w:hAnsi="Times New Roman" w:cs="Times New Roman"/>
-          <w:i/>
-          <w:iCs/>
-        </w:rPr>
-        <w:t>a</w:t>
+      <w:proofErr w:type="spellStart"/>
+      <w:r>
+        <w:rPr>
+          <w:rFonts w:ascii="Times New Roman" w:hAnsi="Times New Roman" w:cs="Times New Roman"/>
+          <w:i/>
+          <w:iCs/>
+        </w:rPr>
+        <w:t>Incilius</w:t>
+      </w:r>
+      <w:proofErr w:type="spellEnd"/>
+      <w:r>
+        <w:rPr>
+          <w:rFonts w:ascii="Times New Roman" w:hAnsi="Times New Roman" w:cs="Times New Roman"/>
+          <w:i/>
+          <w:iCs/>
+        </w:rPr>
+        <w:t xml:space="preserve"> (Bufo) </w:t>
+      </w:r>
+      <w:proofErr w:type="spellStart"/>
+      <w:r>
+        <w:rPr>
+          <w:rFonts w:ascii="Times New Roman" w:hAnsi="Times New Roman" w:cs="Times New Roman"/>
+          <w:i/>
+          <w:iCs/>
+        </w:rPr>
+        <w:t>valliceps</w:t>
       </w:r>
       <w:proofErr w:type="spellEnd"/>
       <w:r>
@@ -967,8 +992,12 @@
       <w:r>
         <w:rPr>
           <w:rFonts w:ascii="Times New Roman" w:hAnsi="Times New Roman" w:cs="Times New Roman"/>
-        </w:rPr>
-        <w:t>BV:</w:t>
+          <w:b/>
+          <w:bCs/>
+          <w:i/>
+          <w:iCs/>
+        </w:rPr>
+        <w:t>BW:</w:t>
       </w:r>
       <w:r>
         <w:rPr>
@@ -985,7 +1014,7 @@
           <w:i/>
           <w:iCs/>
         </w:rPr>
-        <w:t>Incilius</w:t>
+        <w:t>Anaxyrus</w:t>
       </w:r>
       <w:proofErr w:type="spellEnd"/>
       <w:r>
@@ -1003,7 +1032,39 @@
           <w:i/>
           <w:iCs/>
         </w:rPr>
-        <w:t>valliceps</w:t>
+        <w:t>w</w:t>
+      </w:r>
+      <w:r>
+        <w:rPr>
+          <w:rFonts w:ascii="Times New Roman" w:hAnsi="Times New Roman" w:cs="Times New Roman"/>
+          <w:i/>
+          <w:iCs/>
+        </w:rPr>
+        <w:t>oodhousii</w:t>
+      </w:r>
+      <w:proofErr w:type="spellEnd"/>
+      <w:r>
+        <w:rPr>
+          <w:rFonts w:ascii="Times New Roman" w:hAnsi="Times New Roman" w:cs="Times New Roman"/>
+        </w:rPr>
+        <w:t xml:space="preserve">, RCA: </w:t>
+      </w:r>
+      <w:r>
+        <w:rPr>
+          <w:rFonts w:ascii="Times New Roman" w:hAnsi="Times New Roman" w:cs="Times New Roman"/>
+          <w:i/>
+          <w:iCs/>
+        </w:rPr>
+        <w:t xml:space="preserve">Lithobates </w:t>
+      </w:r>
+      <w:proofErr w:type="spellStart"/>
+      <w:r>
+        <w:rPr>
+          <w:rFonts w:ascii="Times New Roman" w:hAnsi="Times New Roman" w:cs="Times New Roman"/>
+          <w:i/>
+          <w:iCs/>
+        </w:rPr>
+        <w:t>catesbeiana</w:t>
       </w:r>
       <w:proofErr w:type="spellEnd"/>
       <w:r>
@@ -1017,60 +1078,32 @@
       <w:r>
         <w:rPr>
           <w:rFonts w:ascii="Times New Roman" w:hAnsi="Times New Roman" w:cs="Times New Roman"/>
-          <w:b/>
-          <w:bCs/>
-          <w:i/>
-          <w:iCs/>
-        </w:rPr>
-        <w:t>BW:</w:t>
-      </w:r>
-      <w:r>
-        <w:rPr>
-          <w:rFonts w:ascii="Times New Roman" w:hAnsi="Times New Roman" w:cs="Times New Roman"/>
-          <w:i/>
-          <w:iCs/>
-        </w:rPr>
-        <w:t xml:space="preserve"> </w:t>
-      </w:r>
-      <w:proofErr w:type="spellStart"/>
-      <w:r>
-        <w:rPr>
-          <w:rFonts w:ascii="Times New Roman" w:hAnsi="Times New Roman" w:cs="Times New Roman"/>
-          <w:i/>
-          <w:iCs/>
-        </w:rPr>
-        <w:t>Anaxyrus</w:t>
-      </w:r>
-      <w:proofErr w:type="spellEnd"/>
-      <w:r>
-        <w:rPr>
-          <w:rFonts w:ascii="Times New Roman" w:hAnsi="Times New Roman" w:cs="Times New Roman"/>
-          <w:i/>
-          <w:iCs/>
-        </w:rPr>
-        <w:t xml:space="preserve"> (Bufo) </w:t>
-      </w:r>
-      <w:proofErr w:type="spellStart"/>
-      <w:r>
-        <w:rPr>
-          <w:rFonts w:ascii="Times New Roman" w:hAnsi="Times New Roman" w:cs="Times New Roman"/>
-          <w:i/>
-          <w:iCs/>
-        </w:rPr>
-        <w:t>w</w:t>
-      </w:r>
-      <w:r>
-        <w:rPr>
-          <w:rFonts w:ascii="Times New Roman" w:hAnsi="Times New Roman" w:cs="Times New Roman"/>
-          <w:i/>
-          <w:iCs/>
-        </w:rPr>
-        <w:t>oodhousii</w:t>
-      </w:r>
-      <w:proofErr w:type="spellEnd"/>
-      <w:r>
-        <w:rPr>
-          <w:rFonts w:ascii="Times New Roman" w:hAnsi="Times New Roman" w:cs="Times New Roman"/>
+        </w:rPr>
+        <w:t>RCL</w:t>
+      </w:r>
+      <w:r>
+        <w:rPr>
+          <w:rFonts w:ascii="Times New Roman" w:hAnsi="Times New Roman" w:cs="Times New Roman"/>
+          <w:i/>
+          <w:iCs/>
+        </w:rPr>
+        <w:t xml:space="preserve">: Lithobates </w:t>
+      </w:r>
+      <w:proofErr w:type="spellStart"/>
+      <w:r>
+        <w:rPr>
+          <w:rFonts w:ascii="Times New Roman" w:hAnsi="Times New Roman" w:cs="Times New Roman"/>
+          <w:i/>
+          <w:iCs/>
+        </w:rPr>
+        <w:t>clamitans</w:t>
+      </w:r>
+      <w:proofErr w:type="spellEnd"/>
+      <w:r>
+        <w:rPr>
+          <w:rFonts w:ascii="Times New Roman" w:hAnsi="Times New Roman" w:cs="Times New Roman"/>
+          <w:i/>
+          <w:iCs/>
         </w:rPr>
         <w:t xml:space="preserve">, </w:t>
       </w:r>
@@ -1078,24 +1111,24 @@
         <w:rPr>
           <w:rFonts w:ascii="Times New Roman" w:hAnsi="Times New Roman" w:cs="Times New Roman"/>
         </w:rPr>
-        <w:t xml:space="preserve">RCA: </w:t>
-      </w:r>
-      <w:r>
-        <w:rPr>
-          <w:rFonts w:ascii="Times New Roman" w:hAnsi="Times New Roman" w:cs="Times New Roman"/>
-          <w:i/>
-          <w:iCs/>
-        </w:rPr>
-        <w:t xml:space="preserve">Lithobates </w:t>
-      </w:r>
-      <w:proofErr w:type="spellStart"/>
-      <w:r>
-        <w:rPr>
-          <w:rFonts w:ascii="Times New Roman" w:hAnsi="Times New Roman" w:cs="Times New Roman"/>
-          <w:i/>
-          <w:iCs/>
-        </w:rPr>
-        <w:t>catesbeiana</w:t>
+        <w:t>RS</w:t>
+      </w:r>
+      <w:r>
+        <w:rPr>
+          <w:rFonts w:ascii="Times New Roman" w:hAnsi="Times New Roman" w:cs="Times New Roman"/>
+          <w:i/>
+          <w:iCs/>
+        </w:rPr>
+        <w:t xml:space="preserve">: Lithobates </w:t>
+      </w:r>
+      <w:proofErr w:type="spellStart"/>
+      <w:r>
+        <w:rPr>
+          <w:rFonts w:ascii="Times New Roman" w:hAnsi="Times New Roman" w:cs="Times New Roman"/>
+          <w:i/>
+          <w:iCs/>
+        </w:rPr>
+        <w:t>sphenocephala</w:t>
       </w:r>
       <w:proofErr w:type="spellEnd"/>
       <w:r>
@@ -1110,86 +1143,6 @@
         <w:rPr>
           <w:rFonts w:ascii="Times New Roman" w:hAnsi="Times New Roman" w:cs="Times New Roman"/>
         </w:rPr>
-        <w:t>RCL</w:t>
-      </w:r>
-      <w:r>
-        <w:rPr>
-          <w:rFonts w:ascii="Times New Roman" w:hAnsi="Times New Roman" w:cs="Times New Roman"/>
-          <w:i/>
-          <w:iCs/>
-        </w:rPr>
-        <w:t>:</w:t>
-      </w:r>
-      <w:r>
-        <w:rPr>
-          <w:rFonts w:ascii="Times New Roman" w:hAnsi="Times New Roman" w:cs="Times New Roman"/>
-          <w:i/>
-          <w:iCs/>
-        </w:rPr>
-        <w:t xml:space="preserve"> Lithobates </w:t>
-      </w:r>
-      <w:proofErr w:type="spellStart"/>
-      <w:r>
-        <w:rPr>
-          <w:rFonts w:ascii="Times New Roman" w:hAnsi="Times New Roman" w:cs="Times New Roman"/>
-          <w:i/>
-          <w:iCs/>
-        </w:rPr>
-        <w:t>clamitans</w:t>
-      </w:r>
-      <w:proofErr w:type="spellEnd"/>
-      <w:r>
-        <w:rPr>
-          <w:rFonts w:ascii="Times New Roman" w:hAnsi="Times New Roman" w:cs="Times New Roman"/>
-          <w:i/>
-          <w:iCs/>
-        </w:rPr>
-        <w:t xml:space="preserve">, </w:t>
-      </w:r>
-      <w:r>
-        <w:rPr>
-          <w:rFonts w:ascii="Times New Roman" w:hAnsi="Times New Roman" w:cs="Times New Roman"/>
-        </w:rPr>
-        <w:t>RS</w:t>
-      </w:r>
-      <w:r>
-        <w:rPr>
-          <w:rFonts w:ascii="Times New Roman" w:hAnsi="Times New Roman" w:cs="Times New Roman"/>
-          <w:i/>
-          <w:iCs/>
-        </w:rPr>
-        <w:t xml:space="preserve">: </w:t>
-      </w:r>
-      <w:r>
-        <w:rPr>
-          <w:rFonts w:ascii="Times New Roman" w:hAnsi="Times New Roman" w:cs="Times New Roman"/>
-          <w:i/>
-          <w:iCs/>
-        </w:rPr>
-        <w:t xml:space="preserve">Lithobates </w:t>
-      </w:r>
-      <w:proofErr w:type="spellStart"/>
-      <w:r>
-        <w:rPr>
-          <w:rFonts w:ascii="Times New Roman" w:hAnsi="Times New Roman" w:cs="Times New Roman"/>
-          <w:i/>
-          <w:iCs/>
-        </w:rPr>
-        <w:t>sphenocephala</w:t>
-      </w:r>
-      <w:proofErr w:type="spellEnd"/>
-      <w:r>
-        <w:rPr>
-          <w:rFonts w:ascii="Times New Roman" w:hAnsi="Times New Roman" w:cs="Times New Roman"/>
-          <w:i/>
-          <w:iCs/>
-        </w:rPr>
-        <w:t xml:space="preserve">, </w:t>
-      </w:r>
-      <w:r>
-        <w:rPr>
-          <w:rFonts w:ascii="Times New Roman" w:hAnsi="Times New Roman" w:cs="Times New Roman"/>
-        </w:rPr>
         <w:t>RP:</w:t>
       </w:r>
       <w:r>
@@ -1198,15 +1151,7 @@
           <w:i/>
           <w:iCs/>
         </w:rPr>
-        <w:t xml:space="preserve"> </w:t>
-      </w:r>
-      <w:r>
-        <w:rPr>
-          <w:rFonts w:ascii="Times New Roman" w:hAnsi="Times New Roman" w:cs="Times New Roman"/>
-          <w:i/>
-          <w:iCs/>
-        </w:rPr>
-        <w:t xml:space="preserve">Lithobates palustris, </w:t>
+        <w:t xml:space="preserve"> Lithobates palustris, </w:t>
       </w:r>
       <w:r>
         <w:rPr>
@@ -1220,15 +1165,7 @@
           <w:i/>
           <w:iCs/>
         </w:rPr>
-        <w:t xml:space="preserve"> </w:t>
-      </w:r>
-      <w:r>
-        <w:rPr>
-          <w:rFonts w:ascii="Times New Roman" w:hAnsi="Times New Roman" w:cs="Times New Roman"/>
-          <w:i/>
-          <w:iCs/>
-        </w:rPr>
-        <w:t xml:space="preserve">Pseudacris crucifer, </w:t>
+        <w:t xml:space="preserve"> Pseudacris crucifer, </w:t>
       </w:r>
       <w:r>
         <w:rPr>
@@ -1242,15 +1179,7 @@
           <w:i/>
           <w:iCs/>
         </w:rPr>
-        <w:t xml:space="preserve"> </w:t>
-      </w:r>
-      <w:r>
-        <w:rPr>
-          <w:rFonts w:ascii="Times New Roman" w:hAnsi="Times New Roman" w:cs="Times New Roman"/>
-          <w:i/>
-          <w:iCs/>
-        </w:rPr>
-        <w:t xml:space="preserve">Pseudacris </w:t>
+        <w:t xml:space="preserve"> Pseudacris </w:t>
       </w:r>
       <w:proofErr w:type="spellStart"/>
       <w:r>
@@ -1398,18 +1327,12 @@
         </w:numPr>
       </w:pPr>
       <w:r>
-        <w:t>“</w:t>
-      </w:r>
-      <w:r>
-        <w:t xml:space="preserve">Climate data </w:t>
+        <w:t xml:space="preserve">“Climate data </w:t>
       </w:r>
       <w:proofErr w:type="spellStart"/>
       <w:proofErr w:type="gramStart"/>
       <w:r>
-        <w:t>preparation</w:t>
-      </w:r>
-      <w:r>
-        <w:t>.Rmd</w:t>
+        <w:t>preparation.Rmd</w:t>
       </w:r>
       <w:proofErr w:type="spellEnd"/>
       <w:proofErr w:type="gramEnd"/>
@@ -1461,10 +1384,7 @@
       <w:proofErr w:type="spellStart"/>
       <w:proofErr w:type="gramStart"/>
       <w:r>
-        <w:t>preparation</w:t>
-      </w:r>
-      <w:r>
-        <w:t>.Rmd</w:t>
+        <w:t>preparation.Rmd</w:t>
       </w:r>
       <w:proofErr w:type="spellEnd"/>
       <w:proofErr w:type="gramEnd"/>
@@ -1526,10 +1446,7 @@
       <w:proofErr w:type="spellStart"/>
       <w:proofErr w:type="gramStart"/>
       <w:r>
-        <w:t>analysis</w:t>
-      </w:r>
-      <w:r>
-        <w:t>.Rmd</w:t>
+        <w:t>analysis.Rmd</w:t>
       </w:r>
       <w:proofErr w:type="spellEnd"/>
       <w:proofErr w:type="gramEnd"/>
@@ -1591,18 +1508,12 @@
         </w:numPr>
       </w:pPr>
       <w:r>
-        <w:t>“</w:t>
-      </w:r>
-      <w:r>
-        <w:t xml:space="preserve">Community transition </w:t>
+        <w:t xml:space="preserve">“Community transition </w:t>
       </w:r>
       <w:proofErr w:type="spellStart"/>
       <w:proofErr w:type="gramStart"/>
       <w:r>
-        <w:t>code</w:t>
-      </w:r>
-      <w:r>
-        <w:t>.Rmd</w:t>
+        <w:t>code.Rmd</w:t>
       </w:r>
       <w:proofErr w:type="spellEnd"/>
       <w:proofErr w:type="gramEnd"/>
@@ -1645,7 +1556,15 @@
       </w:r>
       <w:proofErr w:type="gramEnd"/>
       <w:r>
-        <w:t xml:space="preserve"> changes over time (i.e. analyze it's temporal structure)</w:t>
+        <w:t xml:space="preserve"> changes over time (i.e. analyze </w:t>
+      </w:r>
+      <w:proofErr w:type="gramStart"/>
+      <w:r>
+        <w:t>it's</w:t>
+      </w:r>
+      <w:proofErr w:type="gramEnd"/>
+      <w:r>
+        <w:t xml:space="preserve"> temporal structure)</w:t>
       </w:r>
       <w:r>
         <w:t xml:space="preserve">. </w:t>
@@ -1656,10 +1575,7 @@
       </w:r>
       <w:proofErr w:type="gramEnd"/>
       <w:r>
-        <w:t xml:space="preserve"> various temporal network metrics and respective summary statistics and effect of pond and year. Also has code for network metric figures (Fig. 2 and supplemental figures). Provides o</w:t>
-      </w:r>
-      <w:r>
-        <w:t xml:space="preserve">utput used in </w:t>
+        <w:t xml:space="preserve"> various temporal network metrics and respective summary statistics and effect of pond and year. Also has code for network metric figures (Fig. 2 and supplemental figures). Provides output used in </w:t>
       </w:r>
       <w:proofErr w:type="spellStart"/>
       <w:proofErr w:type="gramStart"/>
@@ -1695,10 +1611,7 @@
       <w:proofErr w:type="spellStart"/>
       <w:proofErr w:type="gramStart"/>
       <w:r>
-        <w:t>climateanalysis</w:t>
-      </w:r>
-      <w:r>
-        <w:t>.Rmd</w:t>
+        <w:t>climateanalysis.Rmd</w:t>
       </w:r>
       <w:proofErr w:type="spellEnd"/>
       <w:proofErr w:type="gramEnd"/>
@@ -1730,18 +1643,12 @@
         </w:numPr>
       </w:pPr>
       <w:r>
-        <w:t>“</w:t>
-      </w:r>
-      <w:r>
-        <w:t xml:space="preserve">Network </w:t>
+        <w:t xml:space="preserve">“Network </w:t>
       </w:r>
       <w:proofErr w:type="spellStart"/>
       <w:proofErr w:type="gramStart"/>
       <w:r>
-        <w:t>plots</w:t>
-      </w:r>
-      <w:r>
-        <w:t>.Rmd</w:t>
+        <w:t>plots.Rmd</w:t>
       </w:r>
       <w:proofErr w:type="spellEnd"/>
       <w:proofErr w:type="gramEnd"/>
@@ -1781,10 +1688,7 @@
       </w:r>
       <w:proofErr w:type="gramStart"/>
       <w:r>
-        <w:t>analysis</w:t>
-      </w:r>
-      <w:r>
-        <w:t>.Rmd</w:t>
+        <w:t>analysis.Rmd</w:t>
       </w:r>
       <w:proofErr w:type="spellEnd"/>
       <w:proofErr w:type="gramEnd"/>
@@ -2628,6 +2532,7 @@
   <w:style w:type="character" w:default="1" w:styleId="DefaultParagraphFont">
     <w:name w:val="Default Paragraph Font"/>
     <w:uiPriority w:val="1"/>
+    <w:semiHidden/>
     <w:unhideWhenUsed/>
   </w:style>
   <w:style w:type="table" w:default="1" w:styleId="TableNormal">

</xml_diff>